<commit_message>
Finalização de atividade do fórum
- Finalização atividade01-forum-ti1
- Criação versão PDF
</commit_message>
<xml_diff>
--- a/semestre-1/tecnologia-da-informaçao-1/atividades-forum/atividade01-forum-matheus-massuda-ti1.docx
+++ b/semestre-1/tecnologia-da-informaçao-1/atividades-forum/atividade01-forum-matheus-massuda-ti1.docx
@@ -175,24 +175,233 @@
         </w:rPr>
         <w:t>Overclock ainda vale a pena nos processadores modernos?</w:t>
       </w:r>
-      <w:r>
-        <w:rPr>
-          <w:rFonts w:ascii="Arial" w:hAnsi="Arial" w:cs="Arial"/>
-          <w:sz w:val="24"/>
-          <w:szCs w:val="24"/>
-        </w:rPr>
-        <w:tab/>
-      </w:r>
     </w:p>
     <w:p>
       <w:pPr>
-        <w:pStyle w:val="PargrafodaLista"/>
         <w:spacing w:line="360" w:lineRule="auto"/>
         <w:jc w:val="both"/>
         <w:rPr>
           <w:rFonts w:ascii="Arial" w:hAnsi="Arial" w:cs="Arial"/>
-          <w:b/>
-          <w:bCs/>
+          <w:sz w:val="24"/>
+          <w:szCs w:val="24"/>
+        </w:rPr>
+      </w:pPr>
+      <w:r>
+        <w:rPr>
+          <w:rFonts w:ascii="Arial" w:hAnsi="Arial" w:cs="Arial"/>
+          <w:sz w:val="24"/>
+          <w:szCs w:val="24"/>
+        </w:rPr>
+        <w:tab/>
+        <w:t xml:space="preserve">O conceito de </w:t>
+      </w:r>
+      <w:r>
+        <w:rPr>
+          <w:rFonts w:ascii="Arial" w:hAnsi="Arial" w:cs="Arial"/>
+          <w:i/>
+          <w:iCs/>
+          <w:sz w:val="24"/>
+          <w:szCs w:val="24"/>
+        </w:rPr>
+        <w:t>overclock</w:t>
+      </w:r>
+      <w:r>
+        <w:rPr>
+          <w:rFonts w:ascii="Arial" w:hAnsi="Arial" w:cs="Arial"/>
+          <w:sz w:val="24"/>
+          <w:szCs w:val="24"/>
+        </w:rPr>
+        <w:t xml:space="preserve"> consist</w:t>
+      </w:r>
+      <w:r>
+        <w:rPr>
+          <w:rFonts w:ascii="Arial" w:hAnsi="Arial" w:cs="Arial"/>
+          <w:sz w:val="24"/>
+          <w:szCs w:val="24"/>
+        </w:rPr>
+        <w:t>e basicamente</w:t>
+      </w:r>
+      <w:r>
+        <w:rPr>
+          <w:rFonts w:ascii="Arial" w:hAnsi="Arial" w:cs="Arial"/>
+          <w:sz w:val="24"/>
+          <w:szCs w:val="24"/>
+        </w:rPr>
+        <w:t xml:space="preserve"> em aumentar, de maneira artificial (forçada e via BIOS), a velocidade de processamento de um processador. Se por um lado, o processador conseguirá realizar tarefas mais exigentes </w:t>
+      </w:r>
+      <w:r>
+        <w:rPr>
+          <w:rFonts w:ascii="Arial" w:hAnsi="Arial" w:cs="Arial"/>
+          <w:sz w:val="24"/>
+          <w:szCs w:val="24"/>
+        </w:rPr>
+        <w:t xml:space="preserve">do </w:t>
+      </w:r>
+      <w:r>
+        <w:rPr>
+          <w:rFonts w:ascii="Arial" w:hAnsi="Arial" w:cs="Arial"/>
+          <w:sz w:val="24"/>
+          <w:szCs w:val="24"/>
+        </w:rPr>
+        <w:t xml:space="preserve">que </w:t>
+      </w:r>
+      <w:r>
+        <w:rPr>
+          <w:rFonts w:ascii="Arial" w:hAnsi="Arial" w:cs="Arial"/>
+          <w:sz w:val="24"/>
+          <w:szCs w:val="24"/>
+        </w:rPr>
+        <w:t>ele conseguia antes</w:t>
+      </w:r>
+      <w:r>
+        <w:rPr>
+          <w:rFonts w:ascii="Arial" w:hAnsi="Arial" w:cs="Arial"/>
+          <w:sz w:val="24"/>
+          <w:szCs w:val="24"/>
+        </w:rPr>
+        <w:t xml:space="preserve">, por outro, ele precisará de mais energia elétrica para fazer essas operações além de que </w:t>
+      </w:r>
+      <w:r>
+        <w:rPr>
+          <w:rFonts w:ascii="Arial" w:hAnsi="Arial" w:cs="Arial"/>
+          <w:sz w:val="24"/>
+          <w:szCs w:val="24"/>
+        </w:rPr>
+        <w:t>sua temperatura</w:t>
+      </w:r>
+      <w:r>
+        <w:rPr>
+          <w:rFonts w:ascii="Arial" w:hAnsi="Arial" w:cs="Arial"/>
+          <w:sz w:val="24"/>
+          <w:szCs w:val="24"/>
+        </w:rPr>
+        <w:t xml:space="preserve"> irá aumentar </w:t>
+      </w:r>
+      <w:r>
+        <w:rPr>
+          <w:rFonts w:ascii="Arial" w:hAnsi="Arial" w:cs="Arial"/>
+          <w:sz w:val="24"/>
+          <w:szCs w:val="24"/>
+        </w:rPr>
+        <w:t xml:space="preserve">consideravelmente, </w:t>
+      </w:r>
+      <w:r>
+        <w:rPr>
+          <w:rFonts w:ascii="Arial" w:hAnsi="Arial" w:cs="Arial"/>
+          <w:sz w:val="24"/>
+          <w:szCs w:val="24"/>
+        </w:rPr>
+        <w:t xml:space="preserve">pois </w:t>
+      </w:r>
+      <w:r>
+        <w:rPr>
+          <w:rFonts w:ascii="Arial" w:hAnsi="Arial" w:cs="Arial"/>
+          <w:sz w:val="24"/>
+          <w:szCs w:val="24"/>
+        </w:rPr>
+        <w:t xml:space="preserve">estará operando perto do limite. </w:t>
+      </w:r>
+      <w:r>
+        <w:rPr>
+          <w:rFonts w:ascii="Arial" w:hAnsi="Arial" w:cs="Arial"/>
+          <w:sz w:val="24"/>
+          <w:szCs w:val="24"/>
+        </w:rPr>
+        <w:t>Desse modo,</w:t>
+      </w:r>
+      <w:r>
+        <w:rPr>
+          <w:rFonts w:ascii="Arial" w:hAnsi="Arial" w:cs="Arial"/>
+          <w:sz w:val="24"/>
+          <w:szCs w:val="24"/>
+        </w:rPr>
+        <w:t xml:space="preserve"> a prática</w:t>
+      </w:r>
+      <w:r>
+        <w:rPr>
+          <w:rFonts w:ascii="Arial" w:hAnsi="Arial" w:cs="Arial"/>
+          <w:sz w:val="24"/>
+          <w:szCs w:val="24"/>
+        </w:rPr>
+        <w:t xml:space="preserve"> </w:t>
+      </w:r>
+      <w:r>
+        <w:rPr>
+          <w:rFonts w:ascii="Arial" w:hAnsi="Arial" w:cs="Arial"/>
+          <w:sz w:val="24"/>
+          <w:szCs w:val="24"/>
+        </w:rPr>
+        <w:t xml:space="preserve">de </w:t>
+      </w:r>
+      <w:r>
+        <w:rPr>
+          <w:rFonts w:ascii="Arial" w:hAnsi="Arial" w:cs="Arial"/>
+          <w:i/>
+          <w:iCs/>
+          <w:sz w:val="24"/>
+          <w:szCs w:val="24"/>
+        </w:rPr>
+        <w:t>overclock</w:t>
+      </w:r>
+      <w:r>
+        <w:rPr>
+          <w:rFonts w:ascii="Arial" w:hAnsi="Arial" w:cs="Arial"/>
+          <w:sz w:val="24"/>
+          <w:szCs w:val="24"/>
+        </w:rPr>
+        <w:t xml:space="preserve"> tende a diminuir a vida útil do componente.</w:t>
+      </w:r>
+    </w:p>
+    <w:p>
+      <w:pPr>
+        <w:spacing w:line="360" w:lineRule="auto"/>
+        <w:jc w:val="both"/>
+        <w:rPr>
+          <w:rFonts w:ascii="Arial" w:hAnsi="Arial" w:cs="Arial"/>
+          <w:sz w:val="24"/>
+          <w:szCs w:val="24"/>
+        </w:rPr>
+      </w:pPr>
+      <w:r>
+        <w:rPr>
+          <w:rFonts w:ascii="Arial" w:hAnsi="Arial" w:cs="Arial"/>
+          <w:sz w:val="24"/>
+          <w:szCs w:val="24"/>
+        </w:rPr>
+        <w:tab/>
+        <w:t xml:space="preserve">Por causa do avanço da tecnologia (principalmente após a pandemia em 2020), a arquitetura de construção dos processadores mais modernos </w:t>
+      </w:r>
+      <w:r>
+        <w:rPr>
+          <w:rFonts w:ascii="Arial" w:hAnsi="Arial" w:cs="Arial"/>
+          <w:sz w:val="24"/>
+          <w:szCs w:val="24"/>
+        </w:rPr>
+        <w:t xml:space="preserve">o </w:t>
+      </w:r>
+      <w:r>
+        <w:rPr>
+          <w:rFonts w:ascii="Arial" w:hAnsi="Arial" w:cs="Arial"/>
+          <w:sz w:val="24"/>
+          <w:szCs w:val="24"/>
+        </w:rPr>
+        <w:t>tornou tão eficiente a ponto de suprir praticamente todas as demandas corriqueiras da maior parte dos usuários. Por isso, essa prática é desinteressante, uma vez que é necessário assumir muito risco em troca de um ligeiro aumento de performance.</w:t>
+      </w:r>
+      <w:r>
+        <w:rPr>
+          <w:rFonts w:ascii="Arial" w:hAnsi="Arial" w:cs="Arial"/>
+          <w:sz w:val="24"/>
+          <w:szCs w:val="24"/>
+        </w:rPr>
+        <w:t xml:space="preserve"> </w:t>
+      </w:r>
+    </w:p>
+    <w:p>
+      <w:pPr>
+        <w:spacing w:line="360" w:lineRule="auto"/>
+        <w:jc w:val="both"/>
+        <w:rPr>
+          <w:rFonts w:ascii="Arial" w:hAnsi="Arial" w:cs="Arial"/>
           <w:sz w:val="24"/>
           <w:szCs w:val="24"/>
         </w:rPr>
@@ -419,6 +628,7 @@
           <w:sz w:val="24"/>
           <w:szCs w:val="24"/>
         </w:rPr>
+        <w:lastRenderedPageBreak/>
         <w:tab/>
       </w:r>
       <w:r>
@@ -509,18 +719,8 @@
           <w:sz w:val="24"/>
           <w:szCs w:val="24"/>
         </w:rPr>
-        <w:t xml:space="preserve">4 até 7%, segundo canal do Youtube </w:t>
-      </w:r>
-      <w:proofErr w:type="spellStart"/>
-      <w:r>
-        <w:rPr>
-          <w:rFonts w:ascii="Arial" w:hAnsi="Arial" w:cs="Arial"/>
-          <w:sz w:val="24"/>
-          <w:szCs w:val="24"/>
-        </w:rPr>
-        <w:t>Adrenaline</w:t>
-      </w:r>
-      <w:proofErr w:type="spellEnd"/>
+        <w:t>4 até 7%, segundo canal do Youtube Adrenaline</w:t>
+      </w:r>
       <w:r>
         <w:rPr>
           <w:rFonts w:ascii="Arial" w:hAnsi="Arial" w:cs="Arial"/>
@@ -544,22 +744,96 @@
         <w:jc w:val="both"/>
         <w:rPr>
           <w:rFonts w:ascii="Arial" w:hAnsi="Arial" w:cs="Arial"/>
-          <w:b/>
-          <w:bCs/>
-          <w:sz w:val="24"/>
-          <w:szCs w:val="24"/>
-        </w:rPr>
-      </w:pPr>
-      <w:r>
-        <w:rPr>
-          <w:rFonts w:ascii="Arial" w:hAnsi="Arial" w:cs="Arial"/>
-          <w:b/>
-          <w:bCs/>
-          <w:sz w:val="24"/>
-          <w:szCs w:val="24"/>
-        </w:rPr>
-        <w:t>QUANTIDADE X USO DE MEMÓRIA</w:t>
-      </w:r>
+          <w:sz w:val="24"/>
+          <w:szCs w:val="24"/>
+        </w:rPr>
+      </w:pPr>
+    </w:p>
+    <w:p>
+      <w:pPr>
+        <w:spacing w:line="360" w:lineRule="auto"/>
+        <w:jc w:val="both"/>
+        <w:rPr>
+          <w:rFonts w:ascii="Arial" w:hAnsi="Arial" w:cs="Arial"/>
+          <w:b/>
+          <w:bCs/>
+          <w:sz w:val="24"/>
+          <w:szCs w:val="24"/>
+        </w:rPr>
+      </w:pPr>
+      <w:r>
+        <w:rPr>
+          <w:rFonts w:ascii="Arial" w:hAnsi="Arial" w:cs="Arial"/>
+          <w:b/>
+          <w:bCs/>
+          <w:sz w:val="24"/>
+          <w:szCs w:val="24"/>
+        </w:rPr>
+        <w:t>QUANTIDADE</w:t>
+      </w:r>
+      <w:r>
+        <w:rPr>
+          <w:rFonts w:ascii="Arial" w:hAnsi="Arial" w:cs="Arial"/>
+          <w:b/>
+          <w:bCs/>
+          <w:sz w:val="24"/>
+          <w:szCs w:val="24"/>
+        </w:rPr>
+        <w:t>S</w:t>
+      </w:r>
+      <w:r>
+        <w:rPr>
+          <w:rFonts w:ascii="Arial" w:hAnsi="Arial" w:cs="Arial"/>
+          <w:b/>
+          <w:bCs/>
+          <w:sz w:val="24"/>
+          <w:szCs w:val="24"/>
+        </w:rPr>
+        <w:t xml:space="preserve"> </w:t>
+      </w:r>
+      <w:r>
+        <w:rPr>
+          <w:rFonts w:ascii="Arial" w:hAnsi="Arial" w:cs="Arial"/>
+          <w:b/>
+          <w:bCs/>
+          <w:sz w:val="24"/>
+          <w:szCs w:val="24"/>
+        </w:rPr>
+        <w:t>E</w:t>
+      </w:r>
+      <w:r>
+        <w:rPr>
+          <w:rFonts w:ascii="Arial" w:hAnsi="Arial" w:cs="Arial"/>
+          <w:b/>
+          <w:bCs/>
+          <w:sz w:val="24"/>
+          <w:szCs w:val="24"/>
+        </w:rPr>
+        <w:t xml:space="preserve"> USO DE MEMÓRIA</w:t>
+      </w:r>
+      <w:r>
+        <w:rPr>
+          <w:rFonts w:ascii="Arial" w:hAnsi="Arial" w:cs="Arial"/>
+          <w:b/>
+          <w:bCs/>
+          <w:sz w:val="24"/>
+          <w:szCs w:val="24"/>
+        </w:rPr>
+        <w:t>S RAM</w:t>
+      </w:r>
+    </w:p>
+    <w:p>
+      <w:pPr>
+        <w:spacing w:line="360" w:lineRule="auto"/>
+        <w:jc w:val="both"/>
+        <w:rPr>
+          <w:rFonts w:ascii="Arial" w:hAnsi="Arial" w:cs="Arial"/>
+          <w:b/>
+          <w:bCs/>
+          <w:sz w:val="24"/>
+          <w:szCs w:val="24"/>
+        </w:rPr>
+      </w:pPr>
     </w:p>
     <w:tbl>
       <w:tblPr>
@@ -592,7 +866,7 @@
           </w:tcPr>
           <w:p>
             <w:pPr>
-              <w:spacing w:line="480" w:lineRule="auto"/>
+              <w:spacing w:line="360" w:lineRule="auto"/>
               <w:rPr>
                 <w:rFonts w:ascii="Arial" w:hAnsi="Arial" w:cs="Arial"/>
                 <w:sz w:val="24"/>
@@ -608,7 +882,7 @@
           </w:tcPr>
           <w:p>
             <w:pPr>
-              <w:spacing w:line="480" w:lineRule="auto"/>
+              <w:spacing w:line="360" w:lineRule="auto"/>
               <w:rPr>
                 <w:rFonts w:ascii="Arial" w:hAnsi="Arial" w:cs="Arial"/>
                 <w:b/>
@@ -636,7 +910,7 @@
           </w:tcPr>
           <w:p>
             <w:pPr>
-              <w:spacing w:line="480" w:lineRule="auto"/>
+              <w:spacing w:line="360" w:lineRule="auto"/>
               <w:rPr>
                 <w:rFonts w:ascii="Arial" w:hAnsi="Arial" w:cs="Arial"/>
                 <w:b/>
@@ -664,7 +938,7 @@
           </w:tcPr>
           <w:p>
             <w:pPr>
-              <w:spacing w:line="480" w:lineRule="auto"/>
+              <w:spacing w:line="360" w:lineRule="auto"/>
               <w:rPr>
                 <w:rFonts w:ascii="Arial" w:hAnsi="Arial" w:cs="Arial"/>
                 <w:b/>
@@ -697,7 +971,7 @@
           </w:tcPr>
           <w:p>
             <w:pPr>
-              <w:spacing w:line="480" w:lineRule="auto"/>
+              <w:spacing w:line="360" w:lineRule="auto"/>
               <w:rPr>
                 <w:rFonts w:ascii="Arial" w:hAnsi="Arial" w:cs="Arial"/>
                 <w:b/>
@@ -725,7 +999,7 @@
           </w:tcPr>
           <w:p>
             <w:pPr>
-              <w:spacing w:line="480" w:lineRule="auto"/>
+              <w:spacing w:line="360" w:lineRule="auto"/>
               <w:rPr>
                 <w:rFonts w:ascii="Arial" w:hAnsi="Arial" w:cs="Arial"/>
                 <w:sz w:val="24"/>
@@ -749,7 +1023,7 @@
           </w:tcPr>
           <w:p>
             <w:pPr>
-              <w:spacing w:line="480" w:lineRule="auto"/>
+              <w:spacing w:line="360" w:lineRule="auto"/>
               <w:rPr>
                 <w:rFonts w:ascii="Arial" w:hAnsi="Arial" w:cs="Arial"/>
                 <w:sz w:val="24"/>
@@ -773,7 +1047,7 @@
           </w:tcPr>
           <w:p>
             <w:pPr>
-              <w:spacing w:line="480" w:lineRule="auto"/>
+              <w:spacing w:line="360" w:lineRule="auto"/>
               <w:rPr>
                 <w:rFonts w:ascii="Arial" w:hAnsi="Arial" w:cs="Arial"/>
                 <w:sz w:val="24"/>
@@ -802,7 +1076,7 @@
           </w:tcPr>
           <w:p>
             <w:pPr>
-              <w:spacing w:line="480" w:lineRule="auto"/>
+              <w:spacing w:line="360" w:lineRule="auto"/>
               <w:rPr>
                 <w:rFonts w:ascii="Arial" w:hAnsi="Arial" w:cs="Arial"/>
                 <w:b/>
@@ -830,7 +1104,7 @@
           </w:tcPr>
           <w:p>
             <w:pPr>
-              <w:spacing w:line="480" w:lineRule="auto"/>
+              <w:spacing w:line="360" w:lineRule="auto"/>
               <w:rPr>
                 <w:rFonts w:ascii="Arial" w:hAnsi="Arial" w:cs="Arial"/>
                 <w:sz w:val="24"/>
@@ -854,7 +1128,7 @@
           </w:tcPr>
           <w:p>
             <w:pPr>
-              <w:spacing w:line="480" w:lineRule="auto"/>
+              <w:spacing w:line="360" w:lineRule="auto"/>
               <w:rPr>
                 <w:rFonts w:ascii="Arial" w:hAnsi="Arial" w:cs="Arial"/>
                 <w:sz w:val="24"/>
@@ -878,7 +1152,7 @@
           </w:tcPr>
           <w:p>
             <w:pPr>
-              <w:spacing w:line="480" w:lineRule="auto"/>
+              <w:spacing w:line="360" w:lineRule="auto"/>
               <w:rPr>
                 <w:rFonts w:ascii="Arial" w:hAnsi="Arial" w:cs="Arial"/>
                 <w:sz w:val="24"/>
@@ -907,7 +1181,7 @@
           </w:tcPr>
           <w:p>
             <w:pPr>
-              <w:spacing w:line="480" w:lineRule="auto"/>
+              <w:spacing w:line="360" w:lineRule="auto"/>
               <w:rPr>
                 <w:rFonts w:ascii="Arial" w:hAnsi="Arial" w:cs="Arial"/>
                 <w:b/>
@@ -924,7 +1198,6 @@
                 <w:sz w:val="24"/>
                 <w:szCs w:val="24"/>
               </w:rPr>
-              <w:lastRenderedPageBreak/>
               <w:t>16GB</w:t>
             </w:r>
           </w:p>
@@ -936,7 +1209,7 @@
           </w:tcPr>
           <w:p>
             <w:pPr>
-              <w:spacing w:line="480" w:lineRule="auto"/>
+              <w:spacing w:line="360" w:lineRule="auto"/>
               <w:rPr>
                 <w:rFonts w:ascii="Arial" w:hAnsi="Arial" w:cs="Arial"/>
                 <w:sz w:val="24"/>
@@ -960,7 +1233,7 @@
           </w:tcPr>
           <w:p>
             <w:pPr>
-              <w:spacing w:line="480" w:lineRule="auto"/>
+              <w:spacing w:line="360" w:lineRule="auto"/>
               <w:rPr>
                 <w:rFonts w:ascii="Arial" w:hAnsi="Arial" w:cs="Arial"/>
                 <w:sz w:val="24"/>
@@ -984,7 +1257,7 @@
           </w:tcPr>
           <w:p>
             <w:pPr>
-              <w:spacing w:line="480" w:lineRule="auto"/>
+              <w:spacing w:line="360" w:lineRule="auto"/>
               <w:rPr>
                 <w:rFonts w:ascii="Arial" w:hAnsi="Arial" w:cs="Arial"/>
                 <w:sz w:val="24"/>
@@ -1010,7 +1283,7 @@
           </w:tcPr>
           <w:p>
             <w:pPr>
-              <w:spacing w:line="480" w:lineRule="auto"/>
+              <w:spacing w:line="360" w:lineRule="auto"/>
               <w:rPr>
                 <w:rFonts w:ascii="Arial" w:hAnsi="Arial" w:cs="Arial"/>
                 <w:b/>
@@ -1038,7 +1311,7 @@
           </w:tcPr>
           <w:p>
             <w:pPr>
-              <w:spacing w:line="480" w:lineRule="auto"/>
+              <w:spacing w:line="360" w:lineRule="auto"/>
               <w:rPr>
                 <w:rFonts w:ascii="Arial" w:hAnsi="Arial" w:cs="Arial"/>
                 <w:sz w:val="24"/>
@@ -1070,7 +1343,7 @@
           </w:tcPr>
           <w:p>
             <w:pPr>
-              <w:spacing w:line="480" w:lineRule="auto"/>
+              <w:spacing w:line="360" w:lineRule="auto"/>
               <w:rPr>
                 <w:rFonts w:ascii="Arial" w:hAnsi="Arial" w:cs="Arial"/>
                 <w:sz w:val="24"/>
@@ -1094,7 +1367,7 @@
           </w:tcPr>
           <w:p>
             <w:pPr>
-              <w:spacing w:line="480" w:lineRule="auto"/>
+              <w:spacing w:line="360" w:lineRule="auto"/>
               <w:rPr>
                 <w:rFonts w:ascii="Arial" w:hAnsi="Arial" w:cs="Arial"/>
                 <w:sz w:val="24"/>
@@ -1119,50 +1392,8 @@
         <w:jc w:val="both"/>
         <w:rPr>
           <w:rFonts w:ascii="Arial" w:hAnsi="Arial" w:cs="Arial"/>
-          <w:sz w:val="24"/>
-          <w:szCs w:val="24"/>
-        </w:rPr>
-      </w:pPr>
-    </w:p>
-    <w:p>
-      <w:pPr>
-        <w:spacing w:line="360" w:lineRule="auto"/>
-        <w:jc w:val="both"/>
-        <w:rPr>
-          <w:rFonts w:ascii="Arial" w:hAnsi="Arial" w:cs="Arial"/>
-          <w:sz w:val="24"/>
-          <w:szCs w:val="24"/>
-        </w:rPr>
-      </w:pPr>
-    </w:p>
-    <w:p>
-      <w:pPr>
-        <w:spacing w:line="360" w:lineRule="auto"/>
-        <w:jc w:val="both"/>
-        <w:rPr>
-          <w:rFonts w:ascii="Arial" w:hAnsi="Arial" w:cs="Arial"/>
-          <w:sz w:val="24"/>
-          <w:szCs w:val="24"/>
-        </w:rPr>
-      </w:pPr>
-    </w:p>
-    <w:p>
-      <w:pPr>
-        <w:spacing w:line="360" w:lineRule="auto"/>
-        <w:jc w:val="both"/>
-        <w:rPr>
-          <w:rFonts w:ascii="Arial" w:hAnsi="Arial" w:cs="Arial"/>
-          <w:sz w:val="24"/>
-          <w:szCs w:val="24"/>
-        </w:rPr>
-      </w:pPr>
-    </w:p>
-    <w:p>
-      <w:pPr>
-        <w:spacing w:line="360" w:lineRule="auto"/>
-        <w:jc w:val="both"/>
-        <w:rPr>
-          <w:rFonts w:ascii="Arial" w:hAnsi="Arial" w:cs="Arial"/>
+          <w:b/>
+          <w:bCs/>
           <w:sz w:val="24"/>
           <w:szCs w:val="24"/>
         </w:rPr>
@@ -1211,6 +1442,243 @@
     </w:p>
     <w:p>
       <w:pPr>
+        <w:spacing w:line="360" w:lineRule="auto"/>
+        <w:jc w:val="both"/>
+        <w:rPr>
+          <w:rFonts w:ascii="Arial" w:hAnsi="Arial" w:cs="Arial"/>
+          <w:b/>
+          <w:bCs/>
+          <w:sz w:val="24"/>
+          <w:szCs w:val="24"/>
+        </w:rPr>
+      </w:pPr>
+      <w:r>
+        <w:rPr>
+          <w:rFonts w:ascii="Arial" w:hAnsi="Arial" w:cs="Arial"/>
+          <w:b/>
+          <w:bCs/>
+          <w:sz w:val="24"/>
+          <w:szCs w:val="24"/>
+        </w:rPr>
+        <w:tab/>
+      </w:r>
+      <w:r>
+        <w:rPr>
+          <w:rFonts w:ascii="Arial" w:hAnsi="Arial" w:cs="Arial"/>
+          <w:sz w:val="24"/>
+          <w:szCs w:val="24"/>
+        </w:rPr>
+        <w:t>Um SSD se desgasta em função da quantidade de vezes em que são gravados dados nele. O</w:t>
+      </w:r>
+      <w:r>
+        <w:rPr>
+          <w:rFonts w:ascii="Arial" w:hAnsi="Arial" w:cs="Arial"/>
+          <w:sz w:val="24"/>
+          <w:szCs w:val="24"/>
+        </w:rPr>
+        <w:t xml:space="preserve"> </w:t>
+      </w:r>
+      <w:r>
+        <w:rPr>
+          <w:rFonts w:ascii="Arial" w:hAnsi="Arial" w:cs="Arial"/>
+          <w:sz w:val="24"/>
+          <w:szCs w:val="24"/>
+        </w:rPr>
+        <w:t>limite de dados que podem ser gravados</w:t>
+      </w:r>
+      <w:r>
+        <w:rPr>
+          <w:rFonts w:ascii="Arial" w:hAnsi="Arial" w:cs="Arial"/>
+          <w:sz w:val="24"/>
+          <w:szCs w:val="24"/>
+        </w:rPr>
+        <w:t xml:space="preserve"> é</w:t>
+      </w:r>
+      <w:r>
+        <w:rPr>
+          <w:rFonts w:ascii="Arial" w:hAnsi="Arial" w:cs="Arial"/>
+          <w:sz w:val="24"/>
+          <w:szCs w:val="24"/>
+        </w:rPr>
+        <w:t xml:space="preserve"> </w:t>
+      </w:r>
+      <w:r>
+        <w:rPr>
+          <w:rFonts w:ascii="Arial" w:hAnsi="Arial" w:cs="Arial"/>
+          <w:sz w:val="24"/>
+          <w:szCs w:val="24"/>
+        </w:rPr>
+        <w:t xml:space="preserve">encontrado </w:t>
+      </w:r>
+      <w:r>
+        <w:rPr>
+          <w:rFonts w:ascii="Arial" w:hAnsi="Arial" w:cs="Arial"/>
+          <w:sz w:val="24"/>
+          <w:szCs w:val="24"/>
+        </w:rPr>
+        <w:t>em sua ficha técnica</w:t>
+      </w:r>
+      <w:r>
+        <w:rPr>
+          <w:rFonts w:ascii="Arial" w:hAnsi="Arial" w:cs="Arial"/>
+          <w:sz w:val="24"/>
+          <w:szCs w:val="24"/>
+        </w:rPr>
+        <w:t xml:space="preserve"> por meio do</w:t>
+      </w:r>
+      <w:r>
+        <w:rPr>
+          <w:rFonts w:ascii="Arial" w:hAnsi="Arial" w:cs="Arial"/>
+          <w:sz w:val="24"/>
+          <w:szCs w:val="24"/>
+        </w:rPr>
+        <w:t xml:space="preserve"> </w:t>
+      </w:r>
+      <w:r>
+        <w:rPr>
+          <w:rFonts w:ascii="Arial" w:hAnsi="Arial" w:cs="Arial"/>
+          <w:b/>
+          <w:bCs/>
+          <w:i/>
+          <w:iCs/>
+          <w:sz w:val="24"/>
+          <w:szCs w:val="24"/>
+        </w:rPr>
+        <w:t>Total Bytes Written</w:t>
+      </w:r>
+      <w:r>
+        <w:rPr>
+          <w:rFonts w:ascii="Arial" w:hAnsi="Arial" w:cs="Arial"/>
+          <w:b/>
+          <w:bCs/>
+          <w:i/>
+          <w:iCs/>
+          <w:sz w:val="24"/>
+          <w:szCs w:val="24"/>
+        </w:rPr>
+        <w:t xml:space="preserve"> - </w:t>
+      </w:r>
+      <w:r>
+        <w:rPr>
+          <w:rFonts w:ascii="Arial" w:hAnsi="Arial" w:cs="Arial"/>
+          <w:b/>
+          <w:bCs/>
+          <w:i/>
+          <w:iCs/>
+          <w:sz w:val="24"/>
+          <w:szCs w:val="24"/>
+        </w:rPr>
+        <w:t>TBW</w:t>
+      </w:r>
+      <w:r>
+        <w:rPr>
+          <w:rFonts w:ascii="Arial" w:hAnsi="Arial" w:cs="Arial"/>
+          <w:sz w:val="24"/>
+          <w:szCs w:val="24"/>
+        </w:rPr>
+        <w:t xml:space="preserve"> que é a quantidade de bytes que podem ser gravados antes que ele comece a apresentar </w:t>
+      </w:r>
+      <w:r>
+        <w:rPr>
+          <w:rFonts w:ascii="Arial" w:hAnsi="Arial" w:cs="Arial"/>
+          <w:sz w:val="24"/>
+          <w:szCs w:val="24"/>
+        </w:rPr>
+        <w:t>algum problema</w:t>
+      </w:r>
+      <w:r>
+        <w:rPr>
+          <w:rFonts w:ascii="Arial" w:hAnsi="Arial" w:cs="Arial"/>
+          <w:sz w:val="24"/>
+          <w:szCs w:val="24"/>
+        </w:rPr>
+        <w:t xml:space="preserve"> por desgaste. Estimasse que um SSD de linha de entrada de </w:t>
+      </w:r>
+      <w:r>
+        <w:rPr>
+          <w:rFonts w:ascii="Arial" w:hAnsi="Arial" w:cs="Arial"/>
+          <w:b/>
+          <w:bCs/>
+          <w:sz w:val="24"/>
+          <w:szCs w:val="24"/>
+        </w:rPr>
+        <w:t>240GB</w:t>
+      </w:r>
+      <w:r>
+        <w:rPr>
+          <w:rFonts w:ascii="Arial" w:hAnsi="Arial" w:cs="Arial"/>
+          <w:sz w:val="24"/>
+          <w:szCs w:val="24"/>
+        </w:rPr>
+        <w:t xml:space="preserve"> tenha um limite de gravação de </w:t>
+      </w:r>
+      <w:r>
+        <w:rPr>
+          <w:rFonts w:ascii="Arial" w:hAnsi="Arial" w:cs="Arial"/>
+          <w:b/>
+          <w:bCs/>
+          <w:sz w:val="24"/>
+          <w:szCs w:val="24"/>
+        </w:rPr>
+        <w:t>100TB</w:t>
+      </w:r>
+      <w:r>
+        <w:rPr>
+          <w:rFonts w:ascii="Arial" w:hAnsi="Arial" w:cs="Arial"/>
+          <w:sz w:val="24"/>
+          <w:szCs w:val="24"/>
+        </w:rPr>
+        <w:t xml:space="preserve"> </w:t>
+      </w:r>
+      <w:r>
+        <w:rPr>
+          <w:rFonts w:ascii="Arial" w:hAnsi="Arial" w:cs="Arial"/>
+          <w:b/>
+          <w:bCs/>
+          <w:sz w:val="24"/>
+          <w:szCs w:val="24"/>
+        </w:rPr>
+        <w:t>(100.000GB)</w:t>
+      </w:r>
+      <w:r>
+        <w:rPr>
+          <w:rFonts w:ascii="Arial" w:hAnsi="Arial" w:cs="Arial"/>
+          <w:b/>
+          <w:bCs/>
+          <w:sz w:val="24"/>
+          <w:szCs w:val="24"/>
+        </w:rPr>
+        <w:t>.</w:t>
+      </w:r>
+    </w:p>
+    <w:p>
+      <w:pPr>
+        <w:spacing w:line="360" w:lineRule="auto"/>
+        <w:jc w:val="both"/>
+        <w:rPr>
+          <w:rFonts w:ascii="Arial" w:hAnsi="Arial" w:cs="Arial"/>
+          <w:b/>
+          <w:bCs/>
+          <w:sz w:val="24"/>
+          <w:szCs w:val="24"/>
+        </w:rPr>
+      </w:pPr>
+    </w:p>
+    <w:p>
+      <w:pPr>
+        <w:spacing w:line="360" w:lineRule="auto"/>
+        <w:jc w:val="both"/>
+        <w:rPr>
+          <w:rFonts w:ascii="Arial" w:hAnsi="Arial" w:cs="Arial"/>
+          <w:b/>
+          <w:bCs/>
+          <w:sz w:val="24"/>
+          <w:szCs w:val="24"/>
+        </w:rPr>
+      </w:pPr>
+    </w:p>
+    <w:p>
+      <w:pPr>
         <w:pStyle w:val="PargrafodaLista"/>
         <w:numPr>
           <w:ilvl w:val="0"/>
@@ -1234,6 +1702,7 @@
           <w:sz w:val="24"/>
           <w:szCs w:val="24"/>
         </w:rPr>
+        <w:lastRenderedPageBreak/>
         <w:t>Como a ventilação do gabinete impacta na temperatura dos componentes?</w:t>
       </w:r>
     </w:p>
@@ -1510,34 +1979,6 @@
         <w:jc w:val="both"/>
         <w:rPr>
           <w:rFonts w:ascii="Arial" w:hAnsi="Arial" w:cs="Arial"/>
-          <w:b/>
-          <w:bCs/>
-          <w:sz w:val="24"/>
-          <w:szCs w:val="24"/>
-        </w:rPr>
-      </w:pPr>
-    </w:p>
-    <w:p>
-      <w:pPr>
-        <w:spacing w:line="360" w:lineRule="auto"/>
-        <w:jc w:val="both"/>
-        <w:rPr>
-          <w:rFonts w:ascii="Arial" w:hAnsi="Arial" w:cs="Arial"/>
-          <w:b/>
-          <w:bCs/>
-          <w:sz w:val="24"/>
-          <w:szCs w:val="24"/>
-        </w:rPr>
-      </w:pPr>
-    </w:p>
-    <w:p>
-      <w:pPr>
-        <w:spacing w:line="360" w:lineRule="auto"/>
-        <w:jc w:val="both"/>
-        <w:rPr>
-          <w:rFonts w:ascii="Arial" w:hAnsi="Arial" w:cs="Arial"/>
-          <w:b/>
-          <w:bCs/>
           <w:sz w:val="24"/>
           <w:szCs w:val="24"/>
         </w:rPr>
@@ -1568,7 +2009,6 @@
           <w:sz w:val="24"/>
           <w:szCs w:val="24"/>
         </w:rPr>
-        <w:lastRenderedPageBreak/>
         <w:t>Como fazer a manutenção preventiva de um computador para aumentar sua vida útil?</w:t>
       </w:r>
     </w:p>
@@ -1674,15 +2114,7 @@
           <w:sz w:val="24"/>
           <w:szCs w:val="24"/>
         </w:rPr>
-        <w:t xml:space="preserve">fluxo de ar </w:t>
-      </w:r>
-      <w:r>
-        <w:rPr>
-          <w:rFonts w:ascii="Arial" w:hAnsi="Arial" w:cs="Arial"/>
-          <w:sz w:val="24"/>
-          <w:szCs w:val="24"/>
-        </w:rPr>
-        <w:t>dentro do gabinete o que</w:t>
+        <w:t>fluxo de ar dentro do gabinete o que</w:t>
       </w:r>
       <w:r>
         <w:rPr>
@@ -1736,7 +2168,6 @@
         </w:rPr>
         <w:t xml:space="preserve">a camada de material que ajuda a conduzir melhor o calor do processador para a o dissipador (chapa metálica) do cooler ou </w:t>
       </w:r>
-      <w:proofErr w:type="spellStart"/>
       <w:r>
         <w:rPr>
           <w:rFonts w:ascii="Arial" w:hAnsi="Arial" w:cs="Arial"/>
@@ -1745,18 +2176,7 @@
           <w:sz w:val="24"/>
           <w:szCs w:val="24"/>
         </w:rPr>
-        <w:t>water</w:t>
-      </w:r>
-      <w:proofErr w:type="spellEnd"/>
-      <w:r>
-        <w:rPr>
-          <w:rFonts w:ascii="Arial" w:hAnsi="Arial" w:cs="Arial"/>
-          <w:i/>
-          <w:iCs/>
-          <w:sz w:val="24"/>
-          <w:szCs w:val="24"/>
-        </w:rPr>
-        <w:t xml:space="preserve"> cooler. </w:t>
+        <w:t xml:space="preserve">water cooler. </w:t>
       </w:r>
       <w:r>
         <w:rPr>
@@ -1826,27 +2246,15 @@
         </w:rPr>
         <w:t xml:space="preserve"> (que entrega a corrente elétrica para o computador) e as </w:t>
       </w:r>
-      <w:proofErr w:type="spellStart"/>
-      <w:r>
-        <w:rPr>
-          <w:rFonts w:ascii="Arial" w:hAnsi="Arial" w:cs="Arial"/>
-          <w:b/>
-          <w:bCs/>
-          <w:sz w:val="24"/>
-          <w:szCs w:val="24"/>
-        </w:rPr>
-        <w:t>fans</w:t>
-      </w:r>
-      <w:proofErr w:type="spellEnd"/>
-      <w:r>
-        <w:rPr>
-          <w:rFonts w:ascii="Arial" w:hAnsi="Arial" w:cs="Arial"/>
-          <w:b/>
-          <w:bCs/>
-          <w:sz w:val="24"/>
-          <w:szCs w:val="24"/>
-        </w:rPr>
-        <w:t xml:space="preserve"> e coolers</w:t>
+      <w:r>
+        <w:rPr>
+          <w:rFonts w:ascii="Arial" w:hAnsi="Arial" w:cs="Arial"/>
+          <w:b/>
+          <w:bCs/>
+          <w:sz w:val="24"/>
+          <w:szCs w:val="24"/>
+        </w:rPr>
+        <w:t>fans e coolers</w:t>
       </w:r>
       <w:r>
         <w:rPr>
@@ -1924,7 +2332,16 @@
           <w:sz w:val="24"/>
           <w:szCs w:val="24"/>
         </w:rPr>
-        <w:t>também ajudam na manutenção preventiva uma vez que removem programas e arquivos desnecessários a aumentam o espaço disponível no disco</w:t>
+        <w:t xml:space="preserve">também ajudam na manutenção preventiva uma vez que removem programas e arquivos desnecessários a </w:t>
+      </w:r>
+      <w:r>
+        <w:rPr>
+          <w:rFonts w:ascii="Arial" w:hAnsi="Arial" w:cs="Arial"/>
+          <w:sz w:val="24"/>
+          <w:szCs w:val="24"/>
+        </w:rPr>
+        <w:lastRenderedPageBreak/>
+        <w:t>aumentam o espaço disponível no disco</w:t>
       </w:r>
       <w:r>
         <w:rPr>
@@ -2035,35 +2452,15 @@
           <w:sz w:val="24"/>
           <w:szCs w:val="24"/>
         </w:rPr>
-        <w:t xml:space="preserve">MEMÓRIAS: Frequências mais altas, latências menores, quanto </w:t>
-      </w:r>
-      <w:proofErr w:type="gramStart"/>
-      <w:r>
-        <w:rPr>
-          <w:rFonts w:ascii="Arial" w:hAnsi="Arial" w:cs="Arial"/>
-          <w:b/>
-          <w:bCs/>
-          <w:sz w:val="24"/>
-          <w:szCs w:val="24"/>
-        </w:rPr>
-        <w:t>importa?</w:t>
-      </w:r>
-      <w:r>
-        <w:rPr>
-          <w:rFonts w:ascii="Arial" w:hAnsi="Arial" w:cs="Arial"/>
-          <w:sz w:val="24"/>
-          <w:szCs w:val="24"/>
-        </w:rPr>
-        <w:t>.</w:t>
-      </w:r>
-      <w:proofErr w:type="gramEnd"/>
-      <w:r>
-        <w:rPr>
-          <w:rFonts w:ascii="Arial" w:hAnsi="Arial" w:cs="Arial"/>
-          <w:sz w:val="24"/>
-          <w:szCs w:val="24"/>
-        </w:rPr>
-        <w:t xml:space="preserve"> Disponível em: &lt; </w:t>
+        <w:t>MEMÓRIAS: Frequências mais altas, latências menores, quanto importa?</w:t>
+      </w:r>
+      <w:r>
+        <w:rPr>
+          <w:rFonts w:ascii="Arial" w:hAnsi="Arial" w:cs="Arial"/>
+          <w:sz w:val="24"/>
+          <w:szCs w:val="24"/>
+        </w:rPr>
+        <w:t xml:space="preserve">. Disponível em: &lt; </w:t>
       </w:r>
       <w:hyperlink r:id="rId5" w:history="1">
         <w:r>
@@ -2073,8 +2470,79 @@
             <w:sz w:val="24"/>
             <w:szCs w:val="24"/>
           </w:rPr>
-          <w:t>https://www.youtube.com/watch?v=luW</w:t>
+          <w:t>https://www.youtube.com/watch?v=luW2rzZ-USM</w:t>
         </w:r>
+      </w:hyperlink>
+      <w:r>
+        <w:rPr>
+          <w:rFonts w:ascii="Arial" w:hAnsi="Arial" w:cs="Arial"/>
+          <w:sz w:val="24"/>
+          <w:szCs w:val="24"/>
+        </w:rPr>
+        <w:t xml:space="preserve"> </w:t>
+      </w:r>
+      <w:r>
+        <w:rPr>
+          <w:rFonts w:ascii="Arial" w:hAnsi="Arial" w:cs="Arial"/>
+          <w:sz w:val="24"/>
+          <w:szCs w:val="24"/>
+        </w:rPr>
+        <w:t xml:space="preserve">&gt;. Acesso em: </w:t>
+      </w:r>
+      <w:r>
+        <w:rPr>
+          <w:rFonts w:ascii="Arial" w:hAnsi="Arial" w:cs="Arial"/>
+          <w:sz w:val="24"/>
+          <w:szCs w:val="24"/>
+        </w:rPr>
+        <w:t>21</w:t>
+      </w:r>
+      <w:r>
+        <w:rPr>
+          <w:rFonts w:ascii="Arial" w:hAnsi="Arial" w:cs="Arial"/>
+          <w:sz w:val="24"/>
+          <w:szCs w:val="24"/>
+        </w:rPr>
+        <w:t xml:space="preserve"> fev. 2025.</w:t>
+      </w:r>
+    </w:p>
+    <w:p>
+      <w:pPr>
+        <w:spacing w:line="360" w:lineRule="auto"/>
+        <w:jc w:val="both"/>
+        <w:rPr>
+          <w:rFonts w:ascii="Arial" w:hAnsi="Arial" w:cs="Arial"/>
+          <w:sz w:val="24"/>
+          <w:szCs w:val="24"/>
+        </w:rPr>
+      </w:pPr>
+      <w:r>
+        <w:rPr>
+          <w:rFonts w:ascii="Arial" w:hAnsi="Arial" w:cs="Arial"/>
+          <w:sz w:val="24"/>
+          <w:szCs w:val="24"/>
+        </w:rPr>
+        <w:t xml:space="preserve">YOUTUBE. </w:t>
+      </w:r>
+      <w:r>
+        <w:rPr>
+          <w:rFonts w:ascii="Arial" w:hAnsi="Arial" w:cs="Arial"/>
+          <w:b/>
+          <w:bCs/>
+          <w:sz w:val="24"/>
+          <w:szCs w:val="24"/>
+        </w:rPr>
+        <w:t xml:space="preserve">SSD realmente dura pouco? </w:t>
+      </w:r>
+      <w:r>
+        <w:rPr>
+          <w:rFonts w:ascii="Arial" w:hAnsi="Arial" w:cs="Arial"/>
+          <w:sz w:val="24"/>
+          <w:szCs w:val="24"/>
+        </w:rPr>
+        <w:t xml:space="preserve">Disponível em: &lt; </w:t>
+      </w:r>
+      <w:hyperlink r:id="rId6" w:history="1">
         <w:r>
           <w:rPr>
             <w:rStyle w:val="Hyperlink"/>
@@ -2082,16 +2550,7 @@
             <w:sz w:val="24"/>
             <w:szCs w:val="24"/>
           </w:rPr>
-          <w:t>2</w:t>
-        </w:r>
-        <w:r>
-          <w:rPr>
-            <w:rStyle w:val="Hyperlink"/>
-            <w:rFonts w:ascii="Arial" w:hAnsi="Arial" w:cs="Arial"/>
-            <w:sz w:val="24"/>
-            <w:szCs w:val="24"/>
-          </w:rPr>
-          <w:t>rzZ-USM</w:t>
+          <w:t>https://www.youtube.com/watch?v=hTeSpQR2nkQ</w:t>
         </w:r>
       </w:hyperlink>
       <w:r>
@@ -2124,7 +2583,7 @@
           <w:sz w:val="24"/>
           <w:szCs w:val="24"/>
         </w:rPr>
-        <w:t xml:space="preserve"> fev. 2025.</w:t>
+        <w:t xml:space="preserve"> fev. 2025</w:t>
       </w:r>
     </w:p>
     <w:p>
@@ -2133,66 +2592,21 @@
         <w:jc w:val="both"/>
         <w:rPr>
           <w:rFonts w:ascii="Arial" w:hAnsi="Arial" w:cs="Arial"/>
-          <w:b/>
-          <w:bCs/>
-          <w:sz w:val="24"/>
-          <w:szCs w:val="24"/>
-        </w:rPr>
-      </w:pPr>
-      <w:proofErr w:type="spellStart"/>
-      <w:r>
-        <w:rPr>
-          <w:rFonts w:ascii="Arial" w:hAnsi="Arial" w:cs="Arial"/>
-          <w:sz w:val="24"/>
-          <w:szCs w:val="24"/>
-        </w:rPr>
-        <w:t>ChatGPT</w:t>
-      </w:r>
-      <w:proofErr w:type="spellEnd"/>
-      <w:r>
-        <w:rPr>
-          <w:rFonts w:ascii="Arial" w:hAnsi="Arial" w:cs="Arial"/>
-          <w:sz w:val="24"/>
-          <w:szCs w:val="24"/>
-        </w:rPr>
-        <w:t xml:space="preserve">. </w:t>
-      </w:r>
-      <w:proofErr w:type="spellStart"/>
-      <w:r>
-        <w:rPr>
-          <w:rFonts w:ascii="Arial" w:hAnsi="Arial" w:cs="Arial"/>
-          <w:sz w:val="24"/>
-          <w:szCs w:val="24"/>
-        </w:rPr>
-        <w:t>Generative</w:t>
-      </w:r>
-      <w:proofErr w:type="spellEnd"/>
-      <w:r>
-        <w:rPr>
-          <w:rFonts w:ascii="Arial" w:hAnsi="Arial" w:cs="Arial"/>
-          <w:sz w:val="24"/>
-          <w:szCs w:val="24"/>
-        </w:rPr>
-        <w:t xml:space="preserve"> </w:t>
-      </w:r>
-      <w:proofErr w:type="spellStart"/>
-      <w:r>
-        <w:rPr>
-          <w:rFonts w:ascii="Arial" w:hAnsi="Arial" w:cs="Arial"/>
-          <w:sz w:val="24"/>
-          <w:szCs w:val="24"/>
-        </w:rPr>
-        <w:t>Pre-trained</w:t>
-      </w:r>
-      <w:proofErr w:type="spellEnd"/>
-      <w:r>
-        <w:rPr>
-          <w:rFonts w:ascii="Arial" w:hAnsi="Arial" w:cs="Arial"/>
-          <w:sz w:val="24"/>
-          <w:szCs w:val="24"/>
-        </w:rPr>
-        <w:t xml:space="preserve"> Transformer. Disponível em: &lt; https://chatgpt.com/ &gt;. Acesso em: 15 fev. 2025.</w:t>
-      </w:r>
+          <w:sz w:val="24"/>
+          <w:szCs w:val="24"/>
+        </w:rPr>
+      </w:pPr>
+    </w:p>
+    <w:p>
+      <w:pPr>
+        <w:spacing w:line="360" w:lineRule="auto"/>
+        <w:jc w:val="both"/>
+        <w:rPr>
+          <w:rFonts w:ascii="Arial" w:hAnsi="Arial" w:cs="Arial"/>
+          <w:sz w:val="24"/>
+          <w:szCs w:val="24"/>
+        </w:rPr>
+      </w:pPr>
     </w:p>
     <w:p>
       <w:pPr>

</xml_diff>